<commit_message>
Revise topic 8 proposal: 500M budget, practitioner-level model design and risk allocation
Co-Authored-By: Claude Sonnet 5.5 <noreply@anthropic.com>
Claude-Session: https://claude.ai/code/session_01RkY1sY93Ps23VxYYrxssVd
</commit_message>
<xml_diff>
--- a/out/proposal_08.docx
+++ b/out/proposal_08.docx
@@ -963,7 +963,7 @@
                 <w:szCs w:val="24"/>
                 <w:rtl/>
               </w:rPr>
-              <w:t xml:space="preserve"> طراحی الگوریتم ارزیابی ریسک قراردادهای بالادستی نفت و گاز ایران و تحلیل سناریوهای ریسک (مطالعه تطبیقی بیع‌متقابل، IPC و قراردادهای نسل جدید مشارکت در تولید)</w:t>
+              <w:t xml:space="preserve"> مدل ارزیابی ریسک قراردادهای بالادستی نفت و گاز ایران و تحلیل سناریو: سنجش هم‌زمان ریسک مالی و تخصیص ریسک بین کارفرما و پیمانکار در بیع‌متقابل، IPC و مشارکت در تولید، با لحاظ رژیم‌های تحریمی</w:t>
             </w:r>
           </w:p>
         </w:tc>
@@ -1020,7 +1020,7 @@
                 <w:szCs w:val="24"/>
                 <w:rtl/>
               </w:rPr>
-              <w:t xml:space="preserve"> مدیریت ریسک و تأمین مالی در قراردادهای نفتی؛ اقتصاد و حسابداری انرژی</w:t>
+              <w:t xml:space="preserve"> مدیریت ریسک و اقتصاد قراردادهای بالادستی؛ مدل‌سازی احتمالی جریان نقدی؛ حسابداری هزینه و بازیافت هزینه</w:t>
             </w:r>
           </w:p>
         </w:tc>
@@ -1343,7 +1343,7 @@
                 <w:szCs w:val="24"/>
                 <w:rtl/>
               </w:rPr>
-              <w:t xml:space="preserve">در این طرح یک «چارچوب ارزیابی ریسک» برای قراردادهای بالادستی نفت و گاز ایران طراحی می‌شود که ریسک هر قرارداد را گام‌به‌گام بسنجد و آن را به عددی قابل مقایسه تبدیل کند. کار در چهار گام انجام می‌شود:</w:t>
+              <w:t xml:space="preserve">مسئله: ریسک یک قرارداد بالادستی امروز معمولاً با یک NPV تک‌عددی و یک ماتریس ریسک کیفی سنجیده می‌شود. این دو جدا از هم‌اند و نشان نمی‌دهند ریسک بین شرکت ملی نفت و پیمانکار چگونه تقسیم شده است. این طرح یک مدل واحد می‌سازد که برای هر قرارداد نشان دهد: (الف) توزیع احتمال NPV هر طرف، نه فقط میانگین؛ (ب) سهم هر طرف از کل نوسان و زیان محتمل؛ (پ) با تغییر رژیم تحریمی کدام بندها اول آسیب می‌بینند.</w:t>
             </w:r>
           </w:p>
           <w:p>
@@ -1359,7 +1359,7 @@
                 <w:szCs w:val="24"/>
                 <w:rtl/>
               </w:rPr>
-              <w:t xml:space="preserve">۱) شناسایی و دسته‌بندی ریسک‌های قراردادهای بیع‌متقابل، IPC و الگوی مشارکت در تولید (نوسان قیمت نفت، تحریم و انتقال ارز، ریسک مخزن و فنی، تأخیر و افزایش هزینه، ریسک بازیافت هزینه و پرداخت، ریسک حقوقی و قراردادی).</w:t>
+              <w:t xml:space="preserve">روش: ثبت ریسک بر پایه بندهای واقعی قرارداد؛ استخراج توزیع‌های P10/P50/P90 از خبرگان با اصلاح خطای قضاوت؛ مدل جریان نقدی تصادفی یک میدان مرجع با همبستگی قیمت، هزینه و تأخیر؛ رژیم تحریمی سه‌حالته (زنجیره مارکوف)؛ مقایسه بیع‌متقابل، IPC و یک الگوی مشارکت در تولید مرجع.</w:t>
             </w:r>
           </w:p>
           <w:p>
@@ -1375,55 +1375,7 @@
                 <w:szCs w:val="24"/>
                 <w:rtl/>
               </w:rPr>
-              <w:t xml:space="preserve">۲) وزن‌دهی و امتیازدهی ریسک‌ها با نظر خبرگان (روش دلفی و فرایند تحلیل سلسله‌مراتبی فازی) و محاسبه یک «شاخص ریسک» برای هر قرارداد.</w:t>
-            </w:r>
-          </w:p>
-          <w:p>
-            <w:pPr>
-              <w:bidi/>
-              <w:spacing w:after="60"/>
-              <w:jc w:val="left"/>
-            </w:pPr>
-            <w:r>
-              <w:rPr>
-                <w:rFonts w:cs="B Nazanin" w:ascii="B Nazanin" w:hAnsi="B Nazanin"/>
-                <w:sz w:val="24"/>
-                <w:szCs w:val="24"/>
-                <w:rtl/>
-              </w:rPr>
-              <w:t xml:space="preserve">۳) ساخت مدل مالی یک میدان نمونه و اجرای شبیه‌سازی مونت‌کارلو برای محاسبه ارزش فعلی خالص (NPV)، نرخ بازده (IRR)، سهم دولت و سهم پیمانکار در سناریوهای پایه، خوش‌بینانه، قیمت پایین نفت، تحریم شدید و تأخیر پروژه.</w:t>
-            </w:r>
-          </w:p>
-          <w:p>
-            <w:pPr>
-              <w:bidi/>
-              <w:spacing w:after="60"/>
-              <w:jc w:val="left"/>
-            </w:pPr>
-            <w:r>
-              <w:rPr>
-                <w:rFonts w:cs="B Nazanin" w:ascii="B Nazanin" w:hAnsi="B Nazanin"/>
-                <w:sz w:val="24"/>
-                <w:szCs w:val="24"/>
-                <w:rtl/>
-              </w:rPr>
-              <w:t xml:space="preserve">۴) تحویل ابزار محاسباتی (اکسل/پایتون) و دستورالعمل کاربرد آن برای واحدهای قراردادی شرکت ملی نفت ایران.</w:t>
-            </w:r>
-          </w:p>
-          <w:p>
-            <w:pPr>
-              <w:bidi/>
-              <w:spacing w:after="60"/>
-              <w:jc w:val="left"/>
-            </w:pPr>
-            <w:r>
-              <w:rPr>
-                <w:rFonts w:cs="B Nazanin" w:ascii="B Nazanin" w:hAnsi="B Nazanin"/>
-                <w:sz w:val="24"/>
-                <w:szCs w:val="24"/>
-                <w:rtl/>
-              </w:rPr>
-              <w:t xml:space="preserve">هدف نهایی: انتخاب و اصلاح ساختار قرارداد پیش از امضا بر پایه ریسک سنجیده‌شده و قابل دفاع.</w:t>
+              <w:t xml:space="preserve">خروجی: مدل محاسباتی (اکسل + پایتون)، ماتریس تخصیص ریسک هر الگو و فهرست بندهای نیازمند اصلاح.</w:t>
             </w:r>
           </w:p>
         </w:tc>
@@ -1536,7 +1488,7 @@
                 <w:szCs w:val="24"/>
                 <w:rtl/>
               </w:rPr>
-              <w:t xml:space="preserve">ارزیابی ریسک قراردادها امروز عمدتاً بر قضاوت کارشناسی، چک‌لیست‌های کیفی و محاسبات اقتصادی تک‌سناریویی (با قیمت و هزینه ثابت) استوار است. محدودیت‌های اصلی:</w:t>
+              <w:t xml:space="preserve">ابزارهای رایج و محدودیت‌هایشان در کاربرد برای قراردادهای ایران:</w:t>
             </w:r>
           </w:p>
           <w:p>
@@ -1552,7 +1504,7 @@
                 <w:szCs w:val="24"/>
                 <w:rtl/>
               </w:rPr>
-              <w:t xml:space="preserve">• ریسک‌های ویژه ایران (تحریم، محدودیت انتقال ارز، تأخیر در پرداخت و تأمین تجهیزات) در مدل‌های مالی متداول جهانی لحاظ نشده‌اند.</w:t>
+              <w:t xml:space="preserve">• ارزیابی تک‌سناریویی NPV: دنباله‌ی چپ توزیع (زیان‌های بزرگ) را پنهان می‌کند. دو قرارداد با NPV برابر می‌توانند احتمال زیان کاملاً متفاوتی داشته باشند.</w:t>
             </w:r>
           </w:p>
           <w:p>
@@ -1568,7 +1520,7 @@
                 <w:szCs w:val="24"/>
                 <w:rtl/>
               </w:rPr>
-              <w:t xml:space="preserve">• تحلیل تک‌سناریویی، احتمال زیان یا شکست اقتصادی قرارداد را نشان نمی‌دهد.</w:t>
+              <w:t xml:space="preserve">• ماتریس ریسک کیفی (احتمال×شدت): ریسک‌ها را مستقل فرض می‌کند، در حالی که در عمل تأخیر، افزایش هزینه سرمایه‌ای و دیرکرد پرداخت هم‌زمان رخ می‌دهند و اثر آنها جمع نمی‌شود، ضرب می‌شود. در بیع‌متقابل، سقف هزینه و جریمه تأخیر این اثر را تشدید می‌کند.</w:t>
             </w:r>
           </w:p>
           <w:p>
@@ -1584,7 +1536,7 @@
                 <w:szCs w:val="24"/>
                 <w:rtl/>
               </w:rPr>
-              <w:t xml:space="preserve">• مقایسه ریسک الگوهای قراردادی مختلف بر پایه یک معیار واحد و شفاف انجام نمی‌شود و ارزیابی‌های کیفی تکرارپذیر و قابل ممیزی نیستند.</w:t>
+              <w:t xml:space="preserve">• نرم‌افزارهای تجاری مالی بالادستی (Aries، Merak و مشابه) برای نظام‌های مالیاتی-امتیازی و PSC متعارف ساخته شده‌اند و سازوکارهایی مانند سقف سرمایه‌ای ثابت، بازیافت هزینه از سهم معین تولید، فی بر بشکه تعدیل‌شده با ریسک، پرداخت به‌صورت نفت یا کالا و تأخیر پرداخت را به شکل بومی ندارند.</w:t>
             </w:r>
           </w:p>
           <w:p>
@@ -1600,7 +1552,39 @@
                 <w:szCs w:val="24"/>
                 <w:rtl/>
               </w:rPr>
-              <w:t xml:space="preserve">نرم‌افزارهای تجاری ارزیابی اقتصادی (مانند Aries و Merak) و ابزارهای شبیه‌سازی (مانند @RISK) وجود دارند اما برای ساختار قراردادهای ایران و ریسک‌های بومی تنظیم نشده‌اند. پژوهش‌های دانشگاهی نیز بیشتر به مرور و طبقه‌بندی ریسک‌های بیع‌متقابل و IPC پرداخته‌اند و کمتر به الگوریتمی کمی و قابل تکرار رسیده‌اند که ارزیابی کیفی و شبیه‌سازی مالی را یکجا بیاورد.</w:t>
+              <w:t xml:space="preserve">• تحریم معمولاً به‌صورت یک تعدیل ثابت نرخ تنزیل لحاظ می‌شود؛ در حالی که تحریم یک رژیم متغیر است که ورود و خروج دارد و اثرش بر پرداخت، تأمین تجهیز و تأمین مالی متفاوت است.</w:t>
+            </w:r>
+          </w:p>
+          <w:p>
+            <w:pPr>
+              <w:bidi/>
+              <w:spacing w:after="60"/>
+              <w:jc w:val="left"/>
+            </w:pPr>
+            <w:r>
+              <w:rPr>
+                <w:rFonts w:cs="B Nazanin" w:ascii="B Nazanin" w:hAnsi="B Nazanin"/>
+                <w:sz w:val="24"/>
+                <w:szCs w:val="24"/>
+                <w:rtl/>
+              </w:rPr>
+              <w:t xml:space="preserve">• در قراردادهای بازیافت هزینه، ریسک «عدم تأیید هزینه در حسابرسی» کمتر مدل می‌شود. این ریسک هزینه‌های پذیرفته‌نشده را از قابل بازیافت خارج می‌کند و به‌طور مستقیم NPV پیمانکار را کم می‌کند.</w:t>
+            </w:r>
+          </w:p>
+          <w:p>
+            <w:pPr>
+              <w:bidi/>
+              <w:spacing w:after="60"/>
+              <w:jc w:val="left"/>
+            </w:pPr>
+            <w:r>
+              <w:rPr>
+                <w:rFonts w:cs="B Nazanin" w:ascii="B Nazanin" w:hAnsi="B Nazanin"/>
+                <w:sz w:val="24"/>
+                <w:szCs w:val="24"/>
+                <w:rtl/>
+              </w:rPr>
+              <w:t xml:space="preserve">پژوهش‌های داخلی عمدتاً ریسک‌ها را فهرست و طبقه‌بندی کرده‌اند؛ به مدل کمّی با همبستگی، رژیم تحریمی و تخصیص ریسک کمتر رسیده‌اند.</w:t>
             </w:r>
           </w:p>
         </w:tc>
@@ -1782,7 +1766,7 @@
                 <w:szCs w:val="24"/>
                 <w:rtl/>
               </w:rPr>
-              <w:t xml:space="preserve">• ترکیب دو لایه در یک الگوریتم: امتیازدهی ریسک بر پایه نظر خبرگان و شبیه‌سازی احتمالی جریان نقدی؛ خروجی هر دو لایه به یک شاخص مشترک می‌رسد.</w:t>
+              <w:t xml:space="preserve">تفاوت این پیشنهاد با پیشنهادهای رایج در ادبیات «طبقه‌بندی ریسک + وزن‌دهی AHP» در چهار نکته است:</w:t>
             </w:r>
           </w:p>
           <w:p>
@@ -1798,7 +1782,7 @@
                 <w:szCs w:val="24"/>
                 <w:rtl/>
               </w:rPr>
-              <w:t xml:space="preserve">• وارد کردن ریسک‌های ویژه تحریم (تأخیر پرداخت، هزینه انتقال ارز، محدودیت تأمین تجهیزات) به‌عنوان متغیر مدل.</w:t>
+              <w:t xml:space="preserve">۱) ریسک‌ها از بند قرارداد استخراج می‌شوند: هر ریسک به یک بند مشخص (سقف هزینه، فرمول فی، سازوکار بازیافت، شرط پرداخت، جریمه تأخیر، حل اختلاف) متصل می‌شود تا نتیجه مستقیم به «کدام بند را چگونه عوض کنیم» برسد.</w:t>
             </w:r>
           </w:p>
           <w:p>
@@ -1814,7 +1798,7 @@
                 <w:szCs w:val="24"/>
                 <w:rtl/>
               </w:rPr>
-              <w:t xml:space="preserve">• مقایسه سه الگوی قراردادی با یک معیار واحد و از دید هر دو طرف (شرکت ملی نفت و پیمانکار).</w:t>
+              <w:t xml:space="preserve">۲) تخصیص ریسک اندازه‌گیری می‌شود: علاوه بر NPV، سهم هر طرف از واریانس و از دنباله زیان (CVaR) محاسبه می‌شود. این همان چیزی است که در مذاکره قرارداد مهم است و در طرح‌های توصیفی دیده نمی‌شود.</w:t>
             </w:r>
           </w:p>
           <w:p>
@@ -1830,7 +1814,7 @@
                 <w:szCs w:val="24"/>
                 <w:rtl/>
               </w:rPr>
-              <w:t xml:space="preserve">• خروجی شفاف، تکرارپذیر و قابل ممیزی؛ ابزار ساده‌ای که بدون نرم‌افزار گران‌قیمت اجرا می‌شود.</w:t>
+              <w:t xml:space="preserve">۳) ریسک‌ها هم‌بسته مدل می‌شوند (مفصل گاوسی/ایمان-کانوور) و تحریم یک رژیم تصادفی است، نه یک ضریب ثابت.</w:t>
             </w:r>
           </w:p>
           <w:p>
@@ -1846,7 +1830,39 @@
                 <w:szCs w:val="24"/>
                 <w:rtl/>
               </w:rPr>
-              <w:t xml:space="preserve">دلیل موفقیت: روش‌های به‌کاررفته (دلفی، AHP فازی، مونت‌کارلو) آزموده‌شده‌اند، داده‌های عمومی برای نسخه اولیه کافی است و تیم اجرایی ترکیبی از تخصص حسابداری و مالی و اقتصاد دارد.</w:t>
+              <w:t xml:space="preserve">۴) ورودی مدل از خبرگان با روش مستند استخراج می‌شود: توزیع P10/P50/P90، اصلاح خطای لنگرانداختن و خوش‌بینی، و واسنجی با داده عمومی تأخیر و افزایش هزینه پروژه‌های بیع‌متقابل گذشته.</w:t>
+            </w:r>
+          </w:p>
+          <w:p>
+            <w:pPr>
+              <w:bidi/>
+              <w:spacing w:after="60"/>
+              <w:jc w:val="left"/>
+            </w:pPr>
+            <w:r>
+              <w:rPr>
+                <w:rFonts w:cs="B Nazanin" w:ascii="B Nazanin" w:hAnsi="B Nazanin"/>
+                <w:sz w:val="24"/>
+                <w:szCs w:val="24"/>
+                <w:rtl/>
+              </w:rPr>
+              <w:t xml:space="preserve">نگاه حسابداری هم بخشی از مدل است: ریسک عدم تأیید هزینه، تفاوت زمان‌بندی شناسایی درآمد و وصول، و اثر پرداخت به‌صورت نفت.</w:t>
+            </w:r>
+          </w:p>
+          <w:p>
+            <w:pPr>
+              <w:bidi/>
+              <w:spacing w:after="60"/>
+              <w:jc w:val="left"/>
+            </w:pPr>
+            <w:r>
+              <w:rPr>
+                <w:rFonts w:cs="B Nazanin" w:ascii="B Nazanin" w:hAnsi="B Nazanin"/>
+                <w:sz w:val="24"/>
+                <w:szCs w:val="24"/>
+                <w:rtl/>
+              </w:rPr>
+              <w:t xml:space="preserve">اعتبار این رویکرد: روش‌ها (مونت‌کارلو با نمونه‌گیری لاتین، زنجیره مارکوف، استخراج نظر کارشناسی ساختاریافته) در صنعت جاافتاده‌اند؛ نوآوری در ترکیب آنها برای ساختار قراردادهای ایران است.</w:t>
             </w:r>
           </w:p>
         </w:tc>
@@ -1969,7 +1985,7 @@
                 <w:szCs w:val="24"/>
                 <w:rtl/>
               </w:rPr>
-              <w:t xml:space="preserve">مرتبط‌ترین بخش‌ها: امور حقوقی و قراردادها، برنامه‌ریزی و اقتصاد (توسعه میادین)، امور مالی و معاونت توسعه و مهندسی.</w:t>
+              <w:t xml:space="preserve">مرتبط‌ترین بخش‌ها: امور حقوقی و قراردادها (طراحی و بازنگری بندها)، برنامه‌ریزی و اقتصاد (ارزیابی میادین)، امور مالی و حسابرسی (بازیافت هزینه و پرداخت)، و معاونت توسعه و مهندسی.</w:t>
             </w:r>
           </w:p>
           <w:p>
@@ -1985,7 +2001,7 @@
                 <w:szCs w:val="24"/>
                 <w:rtl/>
               </w:rPr>
-              <w:t xml:space="preserve">در صورت موفقیت: (۱) قبل از مذاکره، ریسک هر پیشنهاد قراردادی با عدد و بر مبنای روشن سنجیده می‌شود؛ (۲) مقایسه الگوهای قراردادی برای میادین مختلف ممکن می‌شود؛ (۳) نقاط ضعف ساختار قرارداد (مثلاً سازوکار بازیافت هزینه یا تقسیم ریسک تحریم) پیش از امضا آشکار می‌شود؛ (۴) احتمال زیان یا توقف پروژه کاهش می‌یابد و تصمیم‌گیری مستند و قابل دفاع در برابر نهادهای نظارتی خواهد بود.</w:t>
+              <w:t xml:space="preserve">تغییری که در صورت موفقیت ایجاد می‌شود: (۱) پیش از مذاکره روشن می‌شود کدام بندها بیشترین سهم را در احتمال زیان هر طرف دارند؛ (۲) کارفرما می‌تواند بسنجد آیا ساختار پیشنهادی ریسک را به پیمانکاری منتقل کرده که توان تحمل آن را ندارد (و بعداً در اجرا تأخیر و دعوا ایجاد می‌کند)؛ (۳) مقایسه الگوهای قراردادی برای هر میدان بر پایه معیار واحد انجام می‌شود؛ (۴) مبنای مستند برای تصمیم‌های سنگین فراهم می‌شود که در برابر نهادهای نظارتی قابل دفاع است.</w:t>
             </w:r>
           </w:p>
         </w:tc>
@@ -2144,7 +2160,7 @@
                 <w:szCs w:val="24"/>
                 <w:rtl/>
               </w:rPr>
-              <w:t xml:space="preserve">گام ۱ – مرور و تحلیل قراردادها: مقایسه ساختار مالی بیع‌متقابل، IPC و الگوی مشارکت در تولید (نحوه بازیافت هزینه، پاداش، تقسیم سود، مالیات، مدت قرارداد) و مرور ادبیات ریسک.</w:t>
+              <w:t xml:space="preserve">گام ۱ (ماه ۱) – نقشه بندهای ریسک‌زا: تحلیل متن قراردادهای نمونه (بیع‌متقابل، IPC، الگوی مشارکت در تولید مرجع) و ساخت جدول «بند ← سازوکار مالی ← ریسک ← طرف تحمل‌کننده». تحویلی: ماتریس تخصیص ریسک هر الگو (نسخه اولیه).</w:t>
             </w:r>
           </w:p>
           <w:p>
@@ -2160,7 +2176,7 @@
                 <w:szCs w:val="24"/>
                 <w:rtl/>
               </w:rPr>
-              <w:t xml:space="preserve">گام ۲ – شناسایی ریسک: فهرست اولیه ریسک‌ها از ادبیات و اسناد؛ نهایی‌سازی با دلفی در دو دور و با ۱۲ تا ۱۵ خبره (مدیران قراردادی و اقتصادی صنعت نفت و استادان دانشگاه).</w:t>
+              <w:t xml:space="preserve">گام ۲ (ماه ۱ تا ۲) – استخراج نظر خبرگان: دو دور دلفی با ۱۲ تا ۱۵ خبره (قرارداد، اقتصاد، مالی، مدیریت پروژه). به‌جای پرسش «ریسک چقدر است؟»، برای هر ریسک بازه P10/P50/P90 گرفته می‌شود؛ از پرسش‌های واسنجی برای سنجش خطای قضاوت استفاده می‌شود. وزن‌دهی با AHP فازی یا BWM فقط برای رتبه‌بندی کیفی ریسک‌های غیرقابل‌مدل‌سازی به‌کار می‌رود. تحویلی: بانک توزیع‌های ورودی.</w:t>
             </w:r>
           </w:p>
           <w:p>
@@ -2176,7 +2192,7 @@
                 <w:szCs w:val="24"/>
                 <w:rtl/>
               </w:rPr>
-              <w:t xml:space="preserve">گام ۳ – وزن‌دهی و شاخص ریسک: وزن‌دهی ریسک‌ها با AHP فازی؛ امتیازدهی هر ریسک برای هر الگوی قراردادی بر پایه احتمال و شدت؛ ترکیب در یک شاخص ریسک.</w:t>
+              <w:t xml:space="preserve">گام ۳ (ماه ۲ تا ۳) – واسنجی با داده عمومی: برآورد توزیع تأخیر و افزایش هزینه سرمایه‌ای از گزارش‌ها و مقالات منتشرشده درباره پروژه‌های بیع‌متقابل و بالادستی ایران؛ مقایسه با نظر خبرگان و تعدیل. تحویلی: جدول واسنجی و اختلاف‌ها.</w:t>
             </w:r>
           </w:p>
           <w:p>
@@ -2192,7 +2208,7 @@
                 <w:szCs w:val="24"/>
                 <w:rtl/>
               </w:rPr>
-              <w:t xml:space="preserve">گام ۴ – مدل مالی: طراحی میدان نمونه (داده‌های عمومی/معیار) و مدل جریان نقدی برای هر الگوی قراردادی؛ ریسک‌های اصلی با توزیع احتمال (قیمت نفت، هزینه سرمایه‌ای، تأخیر، نرخ تولید، تأخیر پرداخت) در مدل وارد می‌شوند.</w:t>
+              <w:t xml:space="preserve">گام ۴ (ماه ۳ تا ۴) – مدل مالی: میدان مرجع با پارامترهای فرضی ولی معقول؛ قیمت نفت با مدل بازگشت به میانگین و جهش؛ هزینه سرمایه‌ای، تأخیر و تولید با همبستگی؛ رژیم تحریمی سه‌حالته (عادی، متوسط، شدید) با ماتریس انتقال؛ اثر تحریم بر دیرکرد پرداخت، هزینه انتقال ارز، هزینه تأمین تجهیز و نرخ تنزیل پیمانکار؛ ریسک عدم تأیید هزینه در حسابرسی. مکانیزم هر قرارداد (سقف سرمایه‌ای، فی، بازیافت، پاداش، مالیات) مستقیم در مدل پیاده می‌شود. تحویلی: مدل اولیه و مستندات فرض‌ها.</w:t>
             </w:r>
           </w:p>
           <w:p>
@@ -2208,7 +2224,7 @@
                 <w:szCs w:val="24"/>
                 <w:rtl/>
               </w:rPr>
-              <w:t xml:space="preserve">گام ۵ – تحلیل سناریو: اجرای ۱۰٬۰۰۰ تکرار مونت‌کارلو در پنج سناریو (پایه، خوش‌بینانه، قیمت پایین، تحریم شدید، تأخیر پروژه)؛ خروجی‌ها: میانگین و پراکندگی NPV و IRR، احتمال NPV منفی، ارزش در معرض ریسک (VaR)، سهم دولت و پیمانکار و نمودار حساسیت (تورنادو).</w:t>
+              <w:t xml:space="preserve">گام ۵ (ماه ۴ تا ۵) – اجرا و تحلیل: ۲۰٬۰۰۰ تکرار با نمونه‌گیری لاتین‌هایپرکیوب؛ خروجی‌ها: توزیع NPV و IRR دو طرف، احتمال NPV منفی، CVaR، قیمت سربه‌سر، سهم دولت و پیمانکار، سهم هر طرف از واریانس، تحلیل حساسیت (تورنادو و ضریب رتبه‌ای)، و آزمون تنش در پنج سناریو. تحویلی: گزارش مقایسه قراردادها.</w:t>
             </w:r>
           </w:p>
           <w:p>
@@ -2224,7 +2240,7 @@
                 <w:szCs w:val="24"/>
                 <w:rtl/>
               </w:rPr>
-              <w:t xml:space="preserve">گام ۶ – ادغام و اعتبارسنجی: اتصال شاخص ریسک کیفی به نتایج شبیه‌سازی (رتبه‌بندی نهایی قراردادها)، اعتبارسنجی با خبرگان و تحلیل حساسیت.</w:t>
+              <w:t xml:space="preserve">گام ۶ (ماه ۵) – اعتبارسنجی: بازآزمایی مدل روی یک پروژه گذشته با اطلاعات پیش از اجرا و مقایسه با نتیجه واقعی (در حد داده عمومی)، بررسی خبرگان و بازنگری فرض‌ها. تحویلی: گزارش اعتبارسنجی.</w:t>
             </w:r>
           </w:p>
           <w:p>
@@ -2240,7 +2256,7 @@
                 <w:szCs w:val="24"/>
                 <w:rtl/>
               </w:rPr>
-              <w:t xml:space="preserve">گام ۷ – تحویل: گزارش نهایی، ابزار محاسباتی اکسل/پایتون با دفترچه راهنما، و یک مقاله علمی-پژوهشی.</w:t>
+              <w:t xml:space="preserve">گام ۷ (ماه ۶) – تحویل: ابزار (اکسل برای کاربر نهایی + هسته پایتون برای تحلیل)، راهنمای ۲۰ صفحه‌ای، یک فهرست «بندهای نیازمند اصلاح» برای هر الگو، گزارش نهایی و مقاله.</w:t>
             </w:r>
           </w:p>
         </w:tc>
@@ -2417,7 +2433,7 @@
                 <w:szCs w:val="24"/>
                 <w:rtl/>
               </w:rPr>
-              <w:t xml:space="preserve">نمونه خارجی: ابزارهای تجاری ارزیابی اقتصادی و ریسک بالادستی (مانند Aries، Merak و افزونه‌هایی مثل @RISK) و روش‌های مونت‌کارلو در شرکت‌های بین‌المللی نفتی رایج است، ولی برای قراردادهای ایران بومی‌سازی نشده است.</w:t>
+              <w:t xml:space="preserve">نمونه خارجی: ارزیابی ریسک پروژه‌های بالادستی با مونت‌کارلو و استخراج نظر کارشناسی ساختاریافته در شرکت‌های بین‌المللی نفتی رایج است و نرم‌افزارهای تجاری (Aries، Merak و افزونه‌هایی مثل @RISK) برای آن وجود دارند. نمونه‌ای که ساختار قراردادهای ایران (سقف سرمایه‌ای ثابت، فی بر بشکه، پرداخت به‌صورت نفت، رژیم تحریمی) را در خود داشته باشد سراغ نداریم.</w:t>
             </w:r>
           </w:p>
           <w:p>
@@ -2433,7 +2449,7 @@
                 <w:szCs w:val="24"/>
                 <w:rtl/>
               </w:rPr>
-              <w:t xml:space="preserve">نمونه داخلی: پژوهش‌های دانشگاهی درباره ریسک بیع‌متقابل و IPC وجود دارد؛ تا آنجا که اطلاع داریم الگوریتم یکپارچه، کمّی و به‌صورت ابزار قابل استفاده برای شرکت ملی نفت ایران که ارزیابی کیفی خبرگان و شبیه‌سازی مالی را ترکیب کند، در دسترس عمومی نیست.</w:t>
+              <w:t xml:space="preserve">نمونه داخلی: مقالات متعددی ریسک‌های بیع‌متقابل و IPC را فهرست و طبقه‌بندی کرده‌اند. تا آنجا که اطلاع داریم مدل کمّی یکپارچه با همبستگی ریسک‌ها، رژیم تحریمی تصادفی و اندازه‌گیری تخصیص ریسک بین دو طرف، به‌صورت ابزار قابل استفاده در دسترس عمومی نیست (این ادعا در مرحله مرور ادبیات مجدداً راستی‌آزمایی می‌شود).</w:t>
             </w:r>
           </w:p>
         </w:tc>
@@ -2577,7 +2593,7 @@
                 <w:szCs w:val="24"/>
                 <w:rtl/>
               </w:rPr>
-              <w:t xml:space="preserve">این طرح پژوهشی و نرم‌افزاری-تحلیلی است و محصول فیزیکی ندارد؛ واردات کالا یا تجهیزی مطرح نیست. ابزارهای تجاری خارجی نام‌برده شده در این طرح استفاده نمی‌شوند و ابزار نهایی با اکسل/پایتون (متن‌باز) ساخته می‌شود. موضوع مربوط به آمار واردات سالانه قابل اعمال نیست.</w:t>
+              <w:t xml:space="preserve">این طرح پژوهشی و مدل‌سازی است و محصول فیزیکی ندارد؛ واردات کالا یا تجهیز مطرح نیست. ابزار نهایی با اکسل و پایتون متن‌باز ساخته می‌شود و به نرم‌افزار خارجی وابسته نیست. موضوع نام تخصصی گمرکی و میزان واردات سالانه قابل اعمال نیست.</w:t>
             </w:r>
           </w:p>
         </w:tc>
@@ -2710,7 +2726,7 @@
                 <w:szCs w:val="24"/>
                 <w:rtl/>
               </w:rPr>
-              <w:t xml:space="preserve">این طرح مواد اولیه فیزیکی ندارد. ورودی‌های پژوهش عبارت‌اند از: متن عمومی الگوهای قراردادی (بیع‌متقابل، IPC و مدل‌های پیشنهادی)، گزارش‌ها و داده‌های عمومی قیمت و بازار انرژی (مانند EIA، اوپک، بانک مرکزی)، مقالات علمی، نظر خبرگان (دلفی و پرسشنامه) و در صورت همکاری کارفرما، داده‌های میدان نمونه و پارامترهای هزینه‌ای. بدون داده داخلی نیز نسخه اولیه با داده‌های معیار قابل اجرا است.</w:t>
+              <w:t xml:space="preserve">مواد اولیه فیزیکی وجود ندارد. ورودی‌ها: (۱) متن عمومی قراردادهای بیع‌متقابل و IPC و نمونه‌های PSC منتشرشده؛ (۲) گزارش‌ها و مقالات منتشرشده درباره تأخیر و افزایش هزینه پروژه‌های بالادستی ایران برای واسنجی؛ (۳) داده عمومی قیمت و بازار انرژی؛ (۴) توزیع‌های استخراج‌شده از خبرگان؛ (۵) پارامترهای میدان مرجع (فرضی و معقول). در صورت همکاری کارفرما، پارامترهای واقعی یک میدان و آمار پروژه‌های گذشته جایگزین ورودی‌های فرضی می‌شود؛ مدل از ابتدا برای این جایگزینی طراحی می‌شود.</w:t>
             </w:r>
           </w:p>
         </w:tc>
@@ -2783,7 +2799,7 @@
                 <w:szCs w:val="24"/>
                 <w:rtl/>
               </w:rPr>
-              <w:t xml:space="preserve">برآورد اولیه کل هزینه: حدود ۸۲۰ میلیون تومان (قابل تعدیل با توافق کارفرما) به تفکیک:</w:t>
+              <w:t xml:space="preserve">برآورد کل هزینه: ۵۰۰ میلیون تومان، به تفکیک (ارقام به میلیون تومان):</w:t>
             </w:r>
           </w:p>
           <w:p>
@@ -2799,7 +2815,7 @@
                 <w:szCs w:val="24"/>
                 <w:rtl/>
               </w:rPr>
-              <w:t xml:space="preserve">• حق‌التحقیق مجری و همکاران علمی: ۴۵۰</w:t>
+              <w:t xml:space="preserve">• حق‌التحقیق مجری و همکاران علمی (مدیریت طرح، طراحی مدل، تحلیل قراردادی و حسابداری): ۲۷۰</w:t>
             </w:r>
           </w:p>
           <w:p>
@@ -2815,7 +2831,7 @@
                 <w:szCs w:val="24"/>
                 <w:rtl/>
               </w:rPr>
-              <w:t xml:space="preserve">• دستیار پژوهشی و کارشناس ارشد اقتصاد/مالی: ۱۸۰</w:t>
+              <w:t xml:space="preserve">• کارشناس ارشد اقتصاد/مالی برای ساخت و آزمون مدل: ۹۰</w:t>
             </w:r>
           </w:p>
           <w:p>
@@ -2831,7 +2847,7 @@
                 <w:szCs w:val="24"/>
                 <w:rtl/>
               </w:rPr>
-              <w:t xml:space="preserve">• اجرای دلفی و مصاحبه با خبرگان: ۶۰</w:t>
+              <w:t xml:space="preserve">• استخراج نظر خبرگان (دو دور دلفی، جلسات، هماهنگی): ۴۵</w:t>
             </w:r>
           </w:p>
           <w:p>
@@ -2847,7 +2863,7 @@
                 <w:szCs w:val="24"/>
                 <w:rtl/>
               </w:rPr>
-              <w:t xml:space="preserve">• تهیه داده، نرم‌افزار و لایسنس: ۵۰</w:t>
+              <w:t xml:space="preserve">• منابع، داده و نرم‌افزار: ۳۰</w:t>
             </w:r>
           </w:p>
           <w:p>
@@ -2863,7 +2879,7 @@
                 <w:szCs w:val="24"/>
                 <w:rtl/>
               </w:rPr>
-              <w:t xml:space="preserve">• گزارش‌دهی، چاپ، سفر و جلسات: ۴۰</w:t>
+              <w:t xml:space="preserve">• گزارش‌دهی، چاپ و سفر: ۳۰</w:t>
             </w:r>
           </w:p>
           <w:p>
@@ -2879,7 +2895,23 @@
                 <w:szCs w:val="24"/>
                 <w:rtl/>
               </w:rPr>
-              <w:t xml:space="preserve">• هزینه‌های پیش‌بینی‌نشده: ۴۰ (ارقام به میلیون تومان)</w:t>
+              <w:t xml:space="preserve">• هزینه‌های پیش‌بینی‌نشده: ۳۵</w:t>
+            </w:r>
+          </w:p>
+          <w:p>
+            <w:pPr>
+              <w:bidi/>
+              <w:spacing w:after="60"/>
+              <w:jc w:val="left"/>
+            </w:pPr>
+            <w:r>
+              <w:rPr>
+                <w:rFonts w:cs="B Nazanin" w:ascii="B Nazanin" w:hAnsi="B Nazanin"/>
+                <w:sz w:val="24"/>
+                <w:szCs w:val="24"/>
+                <w:rtl/>
+              </w:rPr>
+              <w:t xml:space="preserve">دامنه برای تناسب با این بودجه: سه الگوی قراردادی، یک میدان مرجع و پنج سناریو. افزودن میدان واقعی یا الگوهای بیشتر مشمول بودجه تکمیلی است.</w:t>
             </w:r>
           </w:p>
         </w:tc>
@@ -2996,7 +3028,7 @@
                 <w:szCs w:val="24"/>
                 <w:rtl/>
               </w:rPr>
-              <w:t xml:space="preserve">محصول این طرح یک ابزار تحلیلی برای استفاده داخلی شرکت ملی نفت است، نه کالای بازاری. گزینه‌های جایگزین: (۱) نرم‌افزارهای تجاری ارزیابی اقتصادی که گران‌اند، به لایسنس خارجی وابسته‌اند و ریسک‌های بومی را پوشش نمی‌دهند؛ (۲) خدمات مشاوره‌ای شرکت‌های خارجی که با تحریم قابل دسترس نیست؛ (۳) تحلیل‌های داخلی سنتی که کیفی و تک‌سناریویی‌اند.</w:t>
+              <w:t xml:space="preserve">محصول این طرح ابزار تحلیلی داخلی است نه کالای بازاری. جایگزین‌ها: (۱) نرم‌افزارهای مالی تجاری: گران، وابسته به لایسنس خارجی و فاقد سازوکارهای بومی؛ (۲) مشاوره خارجی: با تحریم عملاً در دسترس نیست؛ (۳) ارزیابی کیفی داخلی: ارزان و سریع ولی غیرکمّی و غیرقابل ممیزی؛ (۴) پژوهش‌های دانشگاهی: بیشتر توصیفی.</w:t>
             </w:r>
           </w:p>
           <w:p>
@@ -3012,7 +3044,7 @@
                 <w:szCs w:val="24"/>
                 <w:rtl/>
               </w:rPr>
-              <w:t xml:space="preserve">مزیت رقابتی: بومی بودن، شفاف بودن فرمول‌ها، قابلیت تنظیم با شرایط ایران، هزینه کم و عدم وابستگی به لایسنس خارجی.</w:t>
+              <w:t xml:space="preserve">مزیت رقابتی: ساختار مدل از روی بندهای واقعی قراردادهای ایران، شفافیت کامل فرمول‌ها، اندازه‌گیری تخصیص ریسک، پیوند با حسابداری هزینه، و امکان به‌روزرسانی توسط خود کارفرما.</w:t>
             </w:r>
           </w:p>
         </w:tc>
@@ -3086,7 +3118,7 @@
                 <w:szCs w:val="24"/>
                 <w:rtl/>
               </w:rPr>
-              <w:t xml:space="preserve">تجهیزات سخت‌افزاری: رایانه‌های شخصی و یک رایانه پردازشی برای شبیه‌سازی (موجود). نرم‌افزار: Microsoft Excel، Python و کتابخانه‌های متن‌باز (NumPy، Pandas، SciPy) موجود و رایگان؛ نرم‌افزار @RISK اختیاری است.</w:t>
+              <w:t xml:space="preserve">تجهیزات و نرم‌افزار: رایانه شخصی و یک رایانه پردازشی برای شبیه‌سازی (موجود)؛ Excel و Python با NumPy، SciPy و Pandas (رایگان). نرم‌افزار @RISK اختیاری و غیرضروری است.</w:t>
             </w:r>
           </w:p>
           <w:p>
@@ -3102,7 +3134,7 @@
                 <w:szCs w:val="24"/>
                 <w:rtl/>
               </w:rPr>
-              <w:t xml:space="preserve">نیازمندی‌ها از کارفرما: دسترسی به اسناد قراردادی، معرفی خبرگان برای دلفی و در صورت امکان یک نمونه داده میدان با پارامترهای هزینه‌ای. این موارد در حال حاضر در اختیار تیم نیست و باید هماهنگ شود.</w:t>
+              <w:t xml:space="preserve">نیازمندی از کارفرما (در حال حاضر در اختیار تیم نیست): معرفی ۱۲ تا ۱۵ خبره برای دلفی؛ متن قراردادهای نمونه (در صورت غیرمحرمانه بودن)؛ در صورت امکان، آمار تأخیر و هزینه پروژه‌های گذشته. بدون اینها طرح با داده عمومی و میدان مرجع اجرا می‌شود ولی دقت واسنجی کمتر خواهد بود.</w:t>
             </w:r>
           </w:p>
         </w:tc>
@@ -3186,7 +3218,7 @@
                 <w:szCs w:val="24"/>
                 <w:rtl/>
               </w:rPr>
-              <w:t xml:space="preserve">مدت کل طرح: ۶ ماه.</w:t>
+              <w:t xml:space="preserve">مدت کل: ۶ ماه با خروجی مشخص در پایان هر مرحله (تحویلی هر گام در بخش «نحوه حل چالش» ذکر شده است).</w:t>
             </w:r>
           </w:p>
           <w:p>
@@ -3202,7 +3234,7 @@
                 <w:szCs w:val="24"/>
                 <w:rtl/>
               </w:rPr>
-              <w:t xml:space="preserve">• ماه ۱: مرور ادبیات و تحلیل ساختار قراردادها (گام ۱) و تدوین فهرست اولیه ریسک‌ها.</w:t>
+              <w:t xml:space="preserve">• ماه ۱: نقشه بندها و ماتریس تخصیص ریسک اولیه (گام ۱) و آغاز دلفی.</w:t>
             </w:r>
           </w:p>
           <w:p>
@@ -3218,7 +3250,7 @@
                 <w:szCs w:val="24"/>
                 <w:rtl/>
               </w:rPr>
-              <w:t xml:space="preserve">• ماه ۲: دلفی و نهایی‌سازی ریسک‌ها (گام ۲).</w:t>
+              <w:t xml:space="preserve">• ماه ۲: دلفی دور دوم و بانک توزیع‌ها (گام ۲) و آغاز واسنجی.</w:t>
             </w:r>
           </w:p>
           <w:p>
@@ -3234,7 +3266,7 @@
                 <w:szCs w:val="24"/>
                 <w:rtl/>
               </w:rPr>
-              <w:t xml:space="preserve">• ماه ۳: وزن‌دهی ریسک‌ها و ساخت شاخص ریسک (گام ۳).</w:t>
+              <w:t xml:space="preserve">• ماه ۳: واسنجی با داده عمومی (گام ۳) و آغاز ساخت مدل.</w:t>
             </w:r>
           </w:p>
           <w:p>
@@ -3250,7 +3282,7 @@
                 <w:szCs w:val="24"/>
                 <w:rtl/>
               </w:rPr>
-              <w:t xml:space="preserve">• ماه ۴ و ۵: مدل مالی میدان نمونه و تحلیل سناریو با مونت‌کارلو (گام‌های ۴ و ۵).</w:t>
+              <w:t xml:space="preserve">• ماه ۴: مدل مالی کامل و آزمون اولیه (گام ۴).</w:t>
             </w:r>
           </w:p>
           <w:p>
@@ -3266,7 +3298,39 @@
                 <w:szCs w:val="24"/>
                 <w:rtl/>
               </w:rPr>
-              <w:t xml:space="preserve">• ماه ۶: ادغام، اعتبارسنجی، تدوین ابزار، گزارش نهایی و مقاله (گام‌های ۶ و ۷).</w:t>
+              <w:t xml:space="preserve">• ماه ۵: اجرای سناریوها و اعتبارسنجی (گام‌های ۵ و ۶).</w:t>
+            </w:r>
+          </w:p>
+          <w:p>
+            <w:pPr>
+              <w:bidi/>
+              <w:spacing w:after="60"/>
+              <w:jc w:val="left"/>
+            </w:pPr>
+            <w:r>
+              <w:rPr>
+                <w:rFonts w:cs="B Nazanin" w:ascii="B Nazanin" w:hAnsi="B Nazanin"/>
+                <w:sz w:val="24"/>
+                <w:szCs w:val="24"/>
+                <w:rtl/>
+              </w:rPr>
+              <w:t xml:space="preserve">• ماه ۶: ابزار، راهنما، گزارش نهایی و مقاله (گام ۷).</w:t>
+            </w:r>
+          </w:p>
+          <w:p>
+            <w:pPr>
+              <w:bidi/>
+              <w:spacing w:after="60"/>
+              <w:jc w:val="left"/>
+            </w:pPr>
+            <w:r>
+              <w:rPr>
+                <w:rFonts w:cs="B Nazanin" w:ascii="B Nazanin" w:hAnsi="B Nazanin"/>
+                <w:sz w:val="24"/>
+                <w:szCs w:val="24"/>
+                <w:rtl/>
+              </w:rPr>
+              <w:t xml:space="preserve">نقطه تصمیم در پایان ماه ۳: در صورت نبود داده کافی، واسنجی با نظر خبرگان تکمیل و محدودیت آن در گزارش اعلام می‌شود.</w:t>
             </w:r>
           </w:p>
         </w:tc>
@@ -3407,7 +3471,7 @@
                 <w:szCs w:val="24"/>
                 <w:rtl/>
               </w:rPr>
-              <w:t xml:space="preserve">• دسترسی محدود به داده واقعی ← استفاده از داده‌های عمومی و میدان معیار و طراحی ابزار به‌گونه‌ای که با داده‌های واقعی جایگزین شود.</w:t>
+              <w:t xml:space="preserve">• ریسک داده: دسترسی نداشتن به داده پروژه‌های گذشته. پاسخ: واسنجی با داده عمومی و نظر خبرگان، طراحی ورودی‌ها به‌گونه‌ای که با داده واقعی جایگزین شود، و اعلام صریح عدم‌قطعیت نتایج در گزارش.</w:t>
             </w:r>
           </w:p>
           <w:p>
@@ -3423,7 +3487,7 @@
                 <w:szCs w:val="24"/>
                 <w:rtl/>
               </w:rPr>
-              <w:t xml:space="preserve">• مشارکت کم خبرگان در دلفی ← دعوت از حدود ۲۰ خبره برای رسیدن به حداقل ۱۲ پاسخ و پیگیری با پشتیبانی کارفرما.</w:t>
+              <w:t xml:space="preserve">• ریسک مدل: افزایش بی‌رویه پیچیدگی که مدل را غیرقابل ممیزی می‌کند. پاسخ: ساختار ماژولار، ثبت کامل فرض‌ها و محدود کردن دامنه به سه قرارداد، یک میدان و پنج سناریو.</w:t>
             </w:r>
           </w:p>
           <w:p>
@@ -3439,7 +3503,7 @@
                 <w:szCs w:val="24"/>
                 <w:rtl/>
               </w:rPr>
-              <w:t xml:space="preserve">• تغییر شرایط تحریم و قیمت در طول طرح ← پارامتری بودن سناریوها و امکان به‌روزرسانی سریع.</w:t>
+              <w:t xml:space="preserve">• ریسک اعتبار نظر خبرگان: خوش‌بینی و لنگرانداختن. پاسخ: بازه P10/P50/P90، پرسش‌های واسنجی و دو دور دلفی؛ ۲۰ دعوت برای حداقل ۱۲ پاسخ.</w:t>
             </w:r>
           </w:p>
           <w:p>
@@ -3455,7 +3519,7 @@
                 <w:szCs w:val="24"/>
                 <w:rtl/>
               </w:rPr>
-              <w:t xml:space="preserve">• پیچیدگی بیش‌ازحد مدل ← ساختار ماژولار و ساده و محدود کردن دامنه به سه الگوی قراردادی و یک میدان نمونه.</w:t>
+              <w:t xml:space="preserve">• ریسک تغییر محیط: تغییر شدت تحریم یا قیمت در حین اجرا. پاسخ: رژیم تحریمی و سناریوها پارامتری‌اند و در چند دقیقه قابل به‌روزرسانی.</w:t>
             </w:r>
           </w:p>
           <w:p>
@@ -3471,7 +3535,23 @@
                 <w:szCs w:val="24"/>
                 <w:rtl/>
               </w:rPr>
-              <w:t xml:space="preserve">• محرمانگی اطلاعات قراردادی ← ناشناس‌سازی داده‌ها و رعایت ضوابط محرمانگی کارفرما.</w:t>
+              <w:t xml:space="preserve">• ریسک محرمانگی: ناشناس‌سازی قراردادهای نمونه و ثبت نظر خبرگان بدون ذکر نام.</w:t>
+            </w:r>
+          </w:p>
+          <w:p>
+            <w:pPr>
+              <w:bidi/>
+              <w:spacing w:after="60"/>
+              <w:jc w:val="left"/>
+            </w:pPr>
+            <w:r>
+              <w:rPr>
+                <w:rFonts w:cs="B Nazanin" w:ascii="B Nazanin" w:hAnsi="B Nazanin"/>
+                <w:sz w:val="24"/>
+                <w:szCs w:val="24"/>
+                <w:rtl/>
+              </w:rPr>
+              <w:t xml:space="preserve">• ریسک تفسیر: استفاده نادرست از خروجی به‌عنوان پیش‌بینی قطعی. پاسخ: مدل برای مقایسه و رتبه‌بندی ساختارها طراحی شده است، نه پیش‌بینی نقطه‌ای NPV؛ این هشدار در راهنما می‌آید.</w:t>
             </w:r>
           </w:p>
         </w:tc>
@@ -3564,7 +3644,7 @@
                 <w:szCs w:val="24"/>
                 <w:rtl/>
               </w:rPr>
-              <w:t xml:space="preserve">مالکیت ابزار نهایی و گزارش‌ها طبق قرارداد با شرکت ملی نفت ایران خواهد بود و مجری حق استفاده علمی دارد. پیشنهاد می‌شود انتشار مقالات علمی با نام مجریان و پس از تأیید کارفرما انجام شود. فناوری سخت‌افزاری یا اختراع قابل ثبت پیش‌بینی نشده است؛ دانش و روش‌شناسی طرح قابل ارائه به‌صورت مقاله و ابزار نرم‌افزاری است.</w:t>
+              <w:t xml:space="preserve">مالکیت ابزار نهایی (فایل‌های مدل، کد و راهنما) و گزارش‌ها طبق قرارداد با شرکت ملی نفت ایران خواهد بود و مجری حق استفاده علمی دارد. پیشنهاد می‌شود انتشار مقالات علمی با نام مجریان و پس از تأیید کارفرما و حذف اطلاعات محرمانه انجام شود. کد با مستندات کامل تحویل می‌شود تا کارفرما به مجری وابسته نماند. اختراع قابل ثبت پیش‌بینی نشده است.</w:t>
             </w:r>
           </w:p>
         </w:tc>
@@ -4076,7 +4156,7 @@
                 <w:szCs w:val="24"/>
                 <w:rtl/>
               </w:rPr>
-              <w:t xml:space="preserve">این طرح پژوهشی است و درآمد مستقیم ندارد. منفعت آن اجتناب از زیان و بهبود شرایط قراردادهاست: کاهش احتمال زیان قراردادها، اصلاح مواد مالی قرارداد پیش از امضا و ارتقای کیفیت تصمیم‌گیری. اندازه‌ی دقیق این منفعت پس از اجرای مدل روی میدان نمونه (به‌صورت تفاوت NPV تعدیل‌شده با ریسک بین ساختارهای قراردادی) گزارش می‌شود. مطالعه امکان‌سنجی ضمیمه نشده است.</w:t>
+              <w:t xml:space="preserve">این طرح پژوهشی است و درآمد مستقیم ندارد. ارزش آن در اجتناب از زیان و بهبود شرایط قرارداد است: اگر مدل نشان دهد یک بند (مثلاً سقف هزینه یا شرط پرداخت) بخش عمده زیان محتمل یک طرف را می‌سازد و اصلاح آن احتمال NPV منفی را کم می‌کند، ارزش آن برابر با زیان اجتناب‌شده است. اندازه آن روی میدان مرجع در گام ۵ گزارش می‌شود و برای قرارداد واقعی پس از جایگزینی پارامترها قابل محاسبه است. عدد قطعی پیش از اجرای مدل ارائه نمی‌شود چون با فرض‌های ساختگی به نتیجه واقعی تبدیل نمی‌شود. مطالعه امکان‌سنجی ضمیمه نشده است.</w:t>
             </w:r>
           </w:p>
         </w:tc>
@@ -4223,7 +4303,7 @@
                 <w:szCs w:val="24"/>
                 <w:rtl/>
               </w:rPr>
-              <w:t xml:space="preserve">• تحویل الگوریتم و ابزار محاسباتی قابل اجرا و دارای دفترچه راهنما، و آزمون شدن آن روی دست‌کم یک میدان نمونه.</w:t>
+              <w:t xml:space="preserve">معیارهای قابل راستی‌آزمایی (کارفرما می‌تواند در پایان طرح بسنجد):</w:t>
             </w:r>
           </w:p>
           <w:p>
@@ -4239,7 +4319,7 @@
                 <w:szCs w:val="24"/>
                 <w:rtl/>
               </w:rPr>
-              <w:t xml:space="preserve">• مقایسه کمّی سه الگوی قراردادی بر اساس شاخص ریسک و نتایج شبیه‌سازی.</w:t>
+              <w:t xml:space="preserve">• تحویل مدل قابل اجرا که از صفر تا نتیجه با راهنما توسط یک کارشناس شرکت ملی نفت و بدون حضور مجری اجرا شود.</w:t>
             </w:r>
           </w:p>
           <w:p>
@@ -4255,7 +4335,7 @@
                 <w:szCs w:val="24"/>
                 <w:rtl/>
               </w:rPr>
-              <w:t xml:space="preserve">• تأیید روایی و کاربردپذیری ابزار توسط حداقل ۱۰ خبره صنعت.</w:t>
+              <w:t xml:space="preserve">• ماتریس تخصیص ریسک و فهرست بندهای نیازمند اصلاح برای هر سه الگوی قراردادی.</w:t>
             </w:r>
           </w:p>
           <w:p>
@@ -4271,7 +4351,39 @@
                 <w:szCs w:val="24"/>
                 <w:rtl/>
               </w:rPr>
-              <w:t xml:space="preserve">• پذیرش مقاله علمی-پژوهشی از طرح و استفاده یا آزمون ابزار توسط یکی از واحدهای شرکت ملی نفت.</w:t>
+              <w:t xml:space="preserve">• گزارش اعتبارسنجی: مدل روی دست‌کم یک پروژه گذشته آزموده و میزان انطباق یا اختلاف آن بیان شده باشد.</w:t>
+            </w:r>
+          </w:p>
+          <w:p>
+            <w:pPr>
+              <w:bidi/>
+              <w:spacing w:after="60"/>
+              <w:jc w:val="left"/>
+            </w:pPr>
+            <w:r>
+              <w:rPr>
+                <w:rFonts w:cs="B Nazanin" w:ascii="B Nazanin" w:hAnsi="B Nazanin"/>
+                <w:sz w:val="24"/>
+                <w:szCs w:val="24"/>
+                <w:rtl/>
+              </w:rPr>
+              <w:t xml:space="preserve">• تأیید کاربردپذیری توسط حداقل ۱۰ خبره و پذیرش یک مقاله علمی-پژوهشی.</w:t>
+            </w:r>
+          </w:p>
+          <w:p>
+            <w:pPr>
+              <w:bidi/>
+              <w:spacing w:after="60"/>
+              <w:jc w:val="left"/>
+            </w:pPr>
+            <w:r>
+              <w:rPr>
+                <w:rFonts w:cs="B Nazanin" w:ascii="B Nazanin" w:hAnsi="B Nazanin"/>
+                <w:sz w:val="24"/>
+                <w:szCs w:val="24"/>
+                <w:rtl/>
+              </w:rPr>
+              <w:t xml:space="preserve">• آزمایش یا استفاده از ابزار توسط یکی از واحدهای شرکت ملی نفت در یک ارزیابی قراردادی.</w:t>
             </w:r>
           </w:p>
         </w:tc>

</xml_diff>